<commit_message>
Fix: 3 Objectives = 3 Hypotheses (matching original PPT design)
Corrected the objectives/hypotheses to match the original study design:
- 3 Objectives (one per DV: craving, impulsivity, mindfulness)
- 3 Null Hypotheses (H01, H02, H03) - all between-group comparisons
  matching the ANCOVA primary analysis

This aligns with the pre-test post-test control group design where
ANCOVA tests the between-group difference controlling for baseline.
</commit_message>
<xml_diff>
--- a/MBRP_Research_Synopsis_APA7.docx
+++ b/MBRP_Research_Synopsis_APA7.docx
@@ -861,47 +861,23 @@
         <w:ind w:firstLine="720"/>
       </w:pPr>
       <w:r>
-        <w:t xml:space="preserve">1. To assess and compare craving levels (pre vs. post) in Experimental (Brief MBRP + TAU) and Control (Psychoeducation + TAU) groups.</w:t>
-      </w:r>
-    </w:p>
-    <w:p>
-      <w:pPr>
-        <w:ind w:firstLine="720"/>
-      </w:pPr>
-      <w:r>
-        <w:t xml:space="preserve">2. To assess and compare impulsivity levels (pre vs. post) in both groups.</w:t>
-      </w:r>
-    </w:p>
-    <w:p>
-      <w:pPr>
-        <w:ind w:firstLine="720"/>
-      </w:pPr>
-      <w:r>
-        <w:t xml:space="preserve">3. To assess and compare mindfulness levels (pre vs. post) in both groups.</w:t>
-      </w:r>
-    </w:p>
-    <w:p>
-      <w:pPr>
-        <w:ind w:firstLine="720"/>
-      </w:pPr>
-      <w:r>
-        <w:t xml:space="preserve">4. To determine whether Brief MBRP + TAU is significantly more effective than Psychoeducation + TAU in reducing craving.</w:t>
-      </w:r>
-    </w:p>
-    <w:p>
-      <w:pPr>
-        <w:ind w:firstLine="720"/>
-      </w:pPr>
-      <w:r>
-        <w:t xml:space="preserve">5. To determine whether Brief MBRP + TAU is significantly more effective than Psychoeducation + TAU in reducing impulsivity.</w:t>
-      </w:r>
-    </w:p>
-    <w:p>
-      <w:pPr>
-        <w:ind w:firstLine="720"/>
-      </w:pPr>
-      <w:r>
-        <w:t xml:space="preserve">6. To determine whether Brief MBRP + TAU is significantly more effective than Psychoeducation + TAU in enhancing mindfulness.</w:t>
+        <w:t xml:space="preserve">1. To assess and compare the effect of Brief MBRP + TAU versus Psychoeducation + TAU on craving (as measured by OCDUS) from pre-test to post-test.</w:t>
+      </w:r>
+    </w:p>
+    <w:p>
+      <w:pPr>
+        <w:ind w:firstLine="720"/>
+      </w:pPr>
+      <w:r>
+        <w:t xml:space="preserve">2. To assess and compare the effect of Brief MBRP + TAU versus Psychoeducation + TAU on impulsivity (as measured by BIS-11) from pre-test to post-test.</w:t>
+      </w:r>
+    </w:p>
+    <w:p>
+      <w:pPr>
+        <w:ind w:firstLine="720"/>
+      </w:pPr>
+      <w:r>
+        <w:t xml:space="preserve">3. To assess and compare the effect of Brief MBRP + TAU versus Psychoeducation + TAU on mindfulness (as measured by FFMQ) from pre-test to post-test.</w:t>
       </w:r>
     </w:p>
     <w:p>
@@ -922,55 +898,39 @@
         <w:ind w:firstLine="720"/>
       </w:pPr>
       <w:r>
-        <w:t xml:space="preserve">The following null hypotheses will be tested in the present study:</w:t>
-      </w:r>
-    </w:p>
-    <w:p>
-      <w:pPr>
-        <w:ind w:firstLine="720"/>
-      </w:pPr>
-      <w:r>
-        <w:t xml:space="preserve">H01: There is no significant difference in pre-test and post-test craving scores (OCDUS) in the Experimental Group (Brief MBRP + TAU).</w:t>
-      </w:r>
-    </w:p>
-    <w:p>
-      <w:pPr>
-        <w:ind w:firstLine="720"/>
-      </w:pPr>
-      <w:r>
-        <w:t xml:space="preserve">H02: There is no significant difference in pre-test and post-test impulsivity scores (BIS-11) in the Experimental Group (Brief MBRP + TAU).</w:t>
-      </w:r>
-    </w:p>
-    <w:p>
-      <w:pPr>
-        <w:ind w:firstLine="720"/>
-      </w:pPr>
-      <w:r>
-        <w:t xml:space="preserve">H03: There is no significant difference in pre-test and post-test mindfulness scores (FFMQ) in the Experimental Group (Brief MBRP + TAU).</w:t>
-      </w:r>
-    </w:p>
-    <w:p>
-      <w:pPr>
-        <w:ind w:firstLine="720"/>
-      </w:pPr>
-      <w:r>
-        <w:t xml:space="preserve">H04: There is no significant difference in craving scores (OCDUS) between the Experimental Group (Brief MBRP + TAU) and the Control Group (Psychoeducation + TAU) from pre-test to post-test.</w:t>
-      </w:r>
-    </w:p>
-    <w:p>
-      <w:pPr>
-        <w:ind w:firstLine="720"/>
-      </w:pPr>
-      <w:r>
-        <w:t xml:space="preserve">H05: There is no significant difference in impulsivity scores (BIS-11) between the Experimental Group (Brief MBRP + TAU) and the Control Group (Psychoeducation + TAU) from pre-test to post-test.</w:t>
-      </w:r>
-    </w:p>
-    <w:p>
-      <w:pPr>
-        <w:ind w:firstLine="720"/>
-      </w:pPr>
-      <w:r>
-        <w:t xml:space="preserve">H06: There is no significant difference in mindfulness scores (FFMQ) between the Experimental Group (Brief MBRP + TAU) and the Control Group (Psychoeducation + TAU) from pre-test to post-test.</w:t>
+        <w:t xml:space="preserve">The following null hypotheses were formulated for the present study:</w:t>
+      </w:r>
+    </w:p>
+    <w:p>
+      <w:pPr>
+        <w:ind w:firstLine="720"/>
+      </w:pPr>
+      <w:r>
+        <w:t xml:space="preserve">H01: There is no significant difference in craving scores (OCDUS) between the Experimental Group (Brief MBRP + TAU) and the Control Group (Psychoeducation + TAU) from pre-test to post-test.</w:t>
+      </w:r>
+    </w:p>
+    <w:p>
+      <w:pPr>
+        <w:ind w:firstLine="720"/>
+      </w:pPr>
+      <w:r>
+        <w:t xml:space="preserve">H02: There is no significant difference in impulsivity scores (BIS-11) between the Experimental Group (Brief MBRP + TAU) and the Control Group (Psychoeducation + TAU) from pre-test to post-test.</w:t>
+      </w:r>
+    </w:p>
+    <w:p>
+      <w:pPr>
+        <w:ind w:firstLine="720"/>
+      </w:pPr>
+      <w:r>
+        <w:t xml:space="preserve">H03: There is no significant difference in mindfulness scores (FFMQ) between the Experimental Group (Brief MBRP + TAU) and the Control Group (Psychoeducation + TAU) from pre-test to post-test.</w:t>
+      </w:r>
+    </w:p>
+    <w:p>
+      <w:pPr>
+        <w:ind w:firstLine="720"/>
+      </w:pPr>
+      <w:r>
+        <w:t xml:space="preserve">Statistical testing: Alpha = 0.05 (two-tailed). Primary analysis: ANCOVA with pre-test scores as covariates.</w:t>
       </w:r>
     </w:p>
     <w:p>

</xml_diff>